<commit_message>
1016148: Reamdme and other change added
</commit_message>
<xml_diff>
--- a/Property-Agreement-Preparation/Property-Agreement-Preparation/wwwroot/Data/Template.docx
+++ b/Property-Agreement-Preparation/Property-Agreement-Preparation/wwwroot/Data/Template.docx
@@ -1940,106 +1940,106 @@
         <w:rPr>
           <w:rFonts w:asciiTheme="majorBidi" w:hAnsiTheme="majorBidi" w:cstheme="majorBidi"/>
         </w:rPr>
+        <w:t>Token Amount Paid</w:t>
+      </w:r>
+      <w:r>
+        <w:rPr>
+          <w:rFonts w:asciiTheme="majorBidi" w:hAnsiTheme="majorBidi" w:cstheme="majorBidi"/>
+        </w:rPr>
+        <w:tab/>
+      </w:r>
+      <w:r>
+        <w:rPr>
+          <w:rFonts w:asciiTheme="majorBidi" w:hAnsiTheme="majorBidi" w:cstheme="majorBidi"/>
+        </w:rPr>
+        <w:t xml:space="preserve">: ₹ </w:t>
+      </w:r>
+      <w:r>
+        <w:rPr>
+          <w:rFonts w:asciiTheme="majorBidi" w:hAnsiTheme="majorBidi" w:cstheme="majorBidi"/>
+        </w:rPr>
+        <w:fldChar w:fldCharType="begin"/>
+      </w:r>
+      <w:r>
+        <w:rPr>
+          <w:rFonts w:asciiTheme="majorBidi" w:hAnsiTheme="majorBidi" w:cstheme="majorBidi"/>
+        </w:rPr>
+        <w:instrText xml:space="preserve"> MERGEFIELD  TokenAmount  \* MERGEFORMAT </w:instrText>
+      </w:r>
+      <w:r>
+        <w:rPr>
+          <w:rFonts w:asciiTheme="majorBidi" w:hAnsiTheme="majorBidi" w:cstheme="majorBidi"/>
+        </w:rPr>
+        <w:fldChar w:fldCharType="separate"/>
+      </w:r>
+      <w:r>
+        <w:rPr>
+          <w:rFonts w:asciiTheme="majorBidi" w:hAnsiTheme="majorBidi" w:cstheme="majorBidi"/>
+          <w:noProof/>
+        </w:rPr>
+        <w:t>«TokenAmount»</w:t>
+      </w:r>
+      <w:r>
+        <w:rPr>
+          <w:rFonts w:asciiTheme="majorBidi" w:hAnsiTheme="majorBidi" w:cstheme="majorBidi"/>
+        </w:rPr>
+        <w:fldChar w:fldCharType="end"/>
+      </w:r>
+      <w:r>
+        <w:rPr>
+          <w:rFonts w:asciiTheme="majorBidi" w:hAnsiTheme="majorBidi" w:cstheme="majorBidi"/>
+        </w:rPr>
+        <w:t xml:space="preserve"> </w:t>
+      </w:r>
+      <w:r>
+        <w:rPr>
+          <w:rFonts w:asciiTheme="majorBidi" w:hAnsiTheme="majorBidi" w:cstheme="majorBidi"/>
+        </w:rPr>
+        <w:t xml:space="preserve">on </w:t>
+      </w:r>
+      <w:r>
+        <w:rPr>
+          <w:rFonts w:asciiTheme="majorBidi" w:hAnsiTheme="majorBidi" w:cstheme="majorBidi"/>
+        </w:rPr>
+        <w:fldChar w:fldCharType="begin"/>
+      </w:r>
+      <w:r>
+        <w:rPr>
+          <w:rFonts w:asciiTheme="majorBidi" w:hAnsiTheme="majorBidi" w:cstheme="majorBidi"/>
+        </w:rPr>
+        <w:instrText xml:space="preserve"> MERGEFIELD  TokenPaymentDate  \* MERGEFORMAT </w:instrText>
+      </w:r>
+      <w:r>
+        <w:rPr>
+          <w:rFonts w:asciiTheme="majorBidi" w:hAnsiTheme="majorBidi" w:cstheme="majorBidi"/>
+        </w:rPr>
+        <w:fldChar w:fldCharType="separate"/>
+      </w:r>
+      <w:r>
+        <w:rPr>
+          <w:rFonts w:asciiTheme="majorBidi" w:hAnsiTheme="majorBidi" w:cstheme="majorBidi"/>
+          <w:noProof/>
+        </w:rPr>
+        <w:t>«TokenPaymentDate»</w:t>
+      </w:r>
+      <w:r>
+        <w:rPr>
+          <w:rFonts w:asciiTheme="majorBidi" w:hAnsiTheme="majorBidi" w:cstheme="majorBidi"/>
+        </w:rPr>
+        <w:fldChar w:fldCharType="end"/>
+      </w:r>
+    </w:p>
+    <w:p>
+      <w:pPr>
+        <w:rPr>
+          <w:rFonts w:asciiTheme="majorBidi" w:hAnsiTheme="majorBidi" w:cstheme="majorBidi"/>
+        </w:rPr>
+      </w:pPr>
+      <w:r>
+        <w:rPr>
+          <w:rFonts w:asciiTheme="majorBidi" w:hAnsiTheme="majorBidi" w:cstheme="majorBidi"/>
+        </w:rPr>
         <w:lastRenderedPageBreak/>
-        <w:t>Token Amount Paid</w:t>
-      </w:r>
-      <w:r>
-        <w:rPr>
-          <w:rFonts w:asciiTheme="majorBidi" w:hAnsiTheme="majorBidi" w:cstheme="majorBidi"/>
-        </w:rPr>
-        <w:tab/>
-      </w:r>
-      <w:r>
-        <w:rPr>
-          <w:rFonts w:asciiTheme="majorBidi" w:hAnsiTheme="majorBidi" w:cstheme="majorBidi"/>
-        </w:rPr>
-        <w:t xml:space="preserve">: ₹ </w:t>
-      </w:r>
-      <w:r>
-        <w:rPr>
-          <w:rFonts w:asciiTheme="majorBidi" w:hAnsiTheme="majorBidi" w:cstheme="majorBidi"/>
-        </w:rPr>
-        <w:fldChar w:fldCharType="begin"/>
-      </w:r>
-      <w:r>
-        <w:rPr>
-          <w:rFonts w:asciiTheme="majorBidi" w:hAnsiTheme="majorBidi" w:cstheme="majorBidi"/>
-        </w:rPr>
-        <w:instrText xml:space="preserve"> MERGEFIELD  TokenAmount  \* MERGEFORMAT </w:instrText>
-      </w:r>
-      <w:r>
-        <w:rPr>
-          <w:rFonts w:asciiTheme="majorBidi" w:hAnsiTheme="majorBidi" w:cstheme="majorBidi"/>
-        </w:rPr>
-        <w:fldChar w:fldCharType="separate"/>
-      </w:r>
-      <w:r>
-        <w:rPr>
-          <w:rFonts w:asciiTheme="majorBidi" w:hAnsiTheme="majorBidi" w:cstheme="majorBidi"/>
-          <w:noProof/>
-        </w:rPr>
-        <w:t>«TokenAmount»</w:t>
-      </w:r>
-      <w:r>
-        <w:rPr>
-          <w:rFonts w:asciiTheme="majorBidi" w:hAnsiTheme="majorBidi" w:cstheme="majorBidi"/>
-        </w:rPr>
-        <w:fldChar w:fldCharType="end"/>
-      </w:r>
-      <w:r>
-        <w:rPr>
-          <w:rFonts w:asciiTheme="majorBidi" w:hAnsiTheme="majorBidi" w:cstheme="majorBidi"/>
-        </w:rPr>
-        <w:t xml:space="preserve"> </w:t>
-      </w:r>
-      <w:r>
-        <w:rPr>
-          <w:rFonts w:asciiTheme="majorBidi" w:hAnsiTheme="majorBidi" w:cstheme="majorBidi"/>
-        </w:rPr>
-        <w:t xml:space="preserve">on </w:t>
-      </w:r>
-      <w:r>
-        <w:rPr>
-          <w:rFonts w:asciiTheme="majorBidi" w:hAnsiTheme="majorBidi" w:cstheme="majorBidi"/>
-        </w:rPr>
-        <w:fldChar w:fldCharType="begin"/>
-      </w:r>
-      <w:r>
-        <w:rPr>
-          <w:rFonts w:asciiTheme="majorBidi" w:hAnsiTheme="majorBidi" w:cstheme="majorBidi"/>
-        </w:rPr>
-        <w:instrText xml:space="preserve"> MERGEFIELD  TokenPaymentDate  \* MERGEFORMAT </w:instrText>
-      </w:r>
-      <w:r>
-        <w:rPr>
-          <w:rFonts w:asciiTheme="majorBidi" w:hAnsiTheme="majorBidi" w:cstheme="majorBidi"/>
-        </w:rPr>
-        <w:fldChar w:fldCharType="separate"/>
-      </w:r>
-      <w:r>
-        <w:rPr>
-          <w:rFonts w:asciiTheme="majorBidi" w:hAnsiTheme="majorBidi" w:cstheme="majorBidi"/>
-          <w:noProof/>
-        </w:rPr>
-        <w:t>«TokenPaymentDate»</w:t>
-      </w:r>
-      <w:r>
-        <w:rPr>
-          <w:rFonts w:asciiTheme="majorBidi" w:hAnsiTheme="majorBidi" w:cstheme="majorBidi"/>
-        </w:rPr>
-        <w:fldChar w:fldCharType="end"/>
-      </w:r>
-    </w:p>
-    <w:p>
-      <w:pPr>
-        <w:rPr>
-          <w:rFonts w:asciiTheme="majorBidi" w:hAnsiTheme="majorBidi" w:cstheme="majorBidi"/>
-        </w:rPr>
-      </w:pPr>
-      <w:r>
-        <w:rPr>
-          <w:rFonts w:asciiTheme="majorBidi" w:hAnsiTheme="majorBidi" w:cstheme="majorBidi"/>
-        </w:rPr>
         <w:t>Balance Amount</w:t>
       </w:r>
       <w:r>
@@ -3038,6 +3038,12 @@
         <w:rPr>
           <w:rFonts w:asciiTheme="majorBidi" w:hAnsiTheme="majorBidi" w:cstheme="majorBidi"/>
         </w:rPr>
+        <w:instrText xml:space="preserve"> </w:instrText>
+      </w:r>
+      <w:r>
+        <w:rPr>
+          <w:rFonts w:asciiTheme="majorBidi" w:hAnsiTheme="majorBidi" w:cstheme="majorBidi"/>
+        </w:rPr>
         <w:instrText>• Encumbrance to be cleared by</w:instrText>
       </w:r>
       <w:r>
@@ -3081,7 +3087,44 @@
         <w:rPr>
           <w:rFonts w:asciiTheme="majorBidi" w:hAnsiTheme="majorBidi" w:cstheme="majorBidi"/>
         </w:rPr>
-        <w:instrText xml:space="preserve">" " " \* MERGEFORMAT </w:instrText>
+        <w:instrText>" "</w:instrText>
+      </w:r>
+      <w:r>
+        <w:rPr>
+          <w:rFonts w:asciiTheme="majorBidi" w:hAnsiTheme="majorBidi" w:cstheme="majorBidi"/>
+        </w:rPr>
+        <w:instrText xml:space="preserve"> </w:instrText>
+      </w:r>
+      <w:r>
+        <w:rPr>
+          <w:rFonts w:asciiTheme="majorBidi" w:hAnsiTheme="majorBidi" w:cstheme="majorBidi"/>
+        </w:rPr>
+        <w:instrText>•</w:instrText>
+      </w:r>
+      <w:r>
+        <w:rPr>
+          <w:rFonts w:asciiTheme="majorBidi" w:hAnsiTheme="majorBidi" w:cstheme="majorBidi"/>
+        </w:rPr>
+        <w:instrText xml:space="preserve"> </w:instrText>
+      </w:r>
+      <w:r>
+        <w:rPr>
+          <w:rFonts w:asciiTheme="majorBidi" w:hAnsiTheme="majorBidi" w:cstheme="majorBidi"/>
+        </w:rPr>
+        <w:instrText>No encumbrance on this property.</w:instrText>
+      </w:r>
+    </w:p>
+    <w:p>
+      <w:pPr>
+        <w:rPr>
+          <w:rFonts w:asciiTheme="majorBidi" w:hAnsiTheme="majorBidi" w:cstheme="majorBidi"/>
+        </w:rPr>
+      </w:pPr>
+      <w:r>
+        <w:rPr>
+          <w:rFonts w:asciiTheme="majorBidi" w:hAnsiTheme="majorBidi" w:cstheme="majorBidi"/>
+        </w:rPr>
+        <w:instrText xml:space="preserve">" \* MERGEFORMAT </w:instrText>
       </w:r>
       <w:r>
         <w:rPr>
@@ -3176,6 +3219,12 @@
         <w:rPr>
           <w:rFonts w:asciiTheme="majorBidi" w:hAnsiTheme="majorBidi" w:cstheme="majorBidi"/>
         </w:rPr>
+        <w:instrText xml:space="preserve"> </w:instrText>
+      </w:r>
+      <w:r>
+        <w:rPr>
+          <w:rFonts w:asciiTheme="majorBidi" w:hAnsiTheme="majorBidi" w:cstheme="majorBidi"/>
+        </w:rPr>
         <w:instrText>Neither party liable for delays due to events beyond reasonable control (natural disasters, pandemics, government restrictions, etc.). Notice period: {ForceMajeureNoticePeriod} days</w:instrText>
       </w:r>
       <w:r>
@@ -3183,6 +3232,18 @@
           <w:rFonts w:asciiTheme="majorBidi" w:hAnsiTheme="majorBidi" w:cstheme="majorBidi"/>
         </w:rPr>
         <w:instrText>" "</w:instrText>
+      </w:r>
+      <w:r>
+        <w:rPr>
+          <w:rFonts w:asciiTheme="majorBidi" w:hAnsiTheme="majorBidi" w:cstheme="majorBidi"/>
+        </w:rPr>
+        <w:instrText xml:space="preserve"> </w:instrText>
+      </w:r>
+      <w:r>
+        <w:rPr>
+          <w:rFonts w:asciiTheme="majorBidi" w:hAnsiTheme="majorBidi" w:cstheme="majorBidi"/>
+        </w:rPr>
+        <w:instrText>Not applicable.</w:instrText>
       </w:r>
       <w:r>
         <w:rPr>

</xml_diff>